<commit_message>
Sprint 1: catalog with filters, stock tracking by size, admin panel (Next.js + Prisma + SQLite)
</commit_message>
<xml_diff>
--- a/DEV_QA/output/architecture_report.docx
+++ b/DEV_QA/output/architecture_report.docx
@@ -10,7 +10,7 @@
         <w:rPr>
           <w:color w:val="1A1A2E"/>
         </w:rPr>
-        <w:t>Архітектурна схема системи</w:t>
+        <w:t>ARCHITECTURE DIAGRAM</w:t>
       </w:r>
     </w:p>
     <w:p>
@@ -24,17 +24,24 @@
         <w:t>LiLu E-Commerce MVP</w:t>
       </w:r>
     </w:p>
+    <w:p/>
     <w:p>
       <w:r>
         <w:rPr>
           <w:b/>
+          <w:sz w:val="24"/>
         </w:rPr>
-        <w:t>Автор: Мульков Максим (Dev/QA, частково SA)</w:t>
+        <w:t>ВЗУТТЄВА ФАБРИКА «LiLu» — E-Commerce Platform</w:t>
       </w:r>
     </w:p>
     <w:p>
       <w:r>
-        <w:t>Дата: 06.04.2026 | Версія: 2.0</w:t>
+        <w:t>Dev/QA: Мульков Максим  |  PM: Мурадян Руслан  |  BA: Покась Ілля</w:t>
+      </w:r>
+    </w:p>
+    <w:p>
+      <w:r>
+        <w:t>Команда: 3Course-PROJECT  |  Дата: 10.04.2026  |  Версія: 2.0</w:t>
       </w:r>
     </w:p>
     <w:p/>
@@ -46,34 +53,42 @@
         <w:rPr>
           <w:color w:val="1A1A2E"/>
         </w:rPr>
-        <w:t>1. Загальна архітектура системи (Three-Tier)</w:t>
+        <w:t xml:space="preserve">1. Загальна архітектура системи </w:t>
+      </w:r>
+      <w:r>
+        <w:rPr>
+          <w:color w:val="1A1A2E"/>
+        </w:rPr>
+        <w:t>(Three-Tier)</w:t>
       </w:r>
     </w:p>
     <w:p>
       <w:r>
-        <w:t>Система побудована за класичною трирівневою архітектурою:</w:t>
+        <w:t>Система побудована за класичною трирівневою архітектурою, яка дозволяє масштабувати кожен рівень незалежно:</w:t>
       </w:r>
     </w:p>
     <w:p>
       <w:r>
-        <w:t>• Клієнтський рівень (Frontend) — Next.js + Tailwind CSS</w:t>
+        <w:t xml:space="preserve">  - Клієнтський рівень (Frontend) — Next.js + Tailwind CSS. SSR для SEO каталогу.</w:t>
       </w:r>
     </w:p>
     <w:p>
       <w:r>
-        <w:t>• Серверний рівень (Backend) — Node.js + Express + Prisma ORM</w:t>
+        <w:t xml:space="preserve">  - Серверний рівень (Backend) — Node.js + Express + </w:t>
+      </w:r>
+      <w:r>
+        <w:t>Prisma ORM. REST API.</w:t>
       </w:r>
     </w:p>
     <w:p>
       <w:r>
-        <w:t>• Рівень даних — PostgreSQL + Redis + Cloudinary</w:t>
+        <w:t xml:space="preserve">  - Рівень даних — PostgreSQL (основна БД) + Redis (кеш) + Cloudinary (фото).</w:t>
       </w:r>
     </w:p>
     <w:p>
       <w:pPr>
         <w:jc w:val="center"/>
       </w:pPr>
-      <w:bookmarkStart w:id="0" w:name="_GoBack"/>
       <w:r>
         <w:rPr>
           <w:noProof/>
@@ -100,19 +115,18 @@
             <v:path o:extrusionok="f" gradientshapeok="t" o:connecttype="rect"/>
             <o:lock v:ext="edit" aspectratio="t"/>
           </v:shapetype>
-          <v:shape id="_x0000_i1025" type="#_x0000_t75" style="width:197.25pt;height:366pt">
+          <v:shape id="_x0000_i1025" type="#_x0000_t75" style="width:186.75pt;height:345.75pt">
             <v:imagedata r:id="rId6" o:title="Загальна архітектура системи 1"/>
           </v:shape>
         </w:pict>
       </w:r>
-      <w:bookmarkEnd w:id="0"/>
       <w:r>
         <w:rPr>
           <w:noProof/>
           <w:lang w:val="ru-RU" w:eastAsia="ru-RU"/>
         </w:rPr>
         <w:pict>
-          <v:shape id="_x0000_i1026" type="#_x0000_t75" style="width:207pt;height:383.25pt">
+          <v:shape id="_x0000_i1026" type="#_x0000_t75" style="width:180.75pt;height:333.75pt">
             <v:imagedata r:id="rId7" o:title="Загальна архітектура системи 2"/>
           </v:shape>
         </w:pict>
@@ -123,11 +137,13 @@
           <w:lang w:val="ru-RU" w:eastAsia="ru-RU"/>
         </w:rPr>
         <w:pict>
-          <v:shape id="_x0000_i1027" type="#_x0000_t75" style="width:197.25pt;height:223.5pt">
+          <v:shape id="_x0000_i1027" type="#_x0000_t75" style="width:233.25pt;height:264pt">
             <v:imagedata r:id="rId8" o:title="Загальна архітектура системи 3"/>
           </v:shape>
         </w:pict>
       </w:r>
+      <w:bookmarkStart w:id="0" w:name="_GoBack"/>
+      <w:bookmarkEnd w:id="0"/>
     </w:p>
     <w:p/>
     <w:p>
@@ -144,7 +160,33 @@
     </w:p>
     <w:p>
       <w:r>
-        <w:t>Показує зв'язки між Frontend, Backend, зовнішніми API (LiqPay, Нова Пошта, Cloudinary) та базою даних.</w:t>
+        <w:t>Покупець та менеджер працюють через різні інтерфейси (каталог та адмін-панель), але спільний Backend API обробляє всі з</w:t>
+      </w:r>
+      <w:r>
+        <w:t>апити. Зовнішні інтеграції:</w:t>
+      </w:r>
+    </w:p>
+    <w:p>
+      <w:r>
+        <w:t xml:space="preserve">  - LiqPay (ПриватБанк) — онлайн-оплата карткою</w:t>
+      </w:r>
+    </w:p>
+    <w:p>
+      <w:r>
+        <w:t xml:space="preserve">  - Нова Пошта API — вибір відділення, розрахунок вартості, створення ТТН</w:t>
+      </w:r>
+    </w:p>
+    <w:p>
+      <w:r>
+        <w:t xml:space="preserve">  - Cloudinary — зберігання та оптимізація фото товарів</w:t>
+      </w:r>
+    </w:p>
+    <w:p>
+      <w:r>
+        <w:t xml:space="preserve">  - Tawk.to — безкоштовний popup-чат для консульта</w:t>
+      </w:r>
+      <w:r>
+        <w:t>цій</w:t>
       </w:r>
     </w:p>
     <w:p>
@@ -207,15 +249,457 @@
     </w:p>
     <w:p>
       <w:r>
-        <w:t>Основні сутності: Category, Product, ProductSize (облік складу по розмірах), User, Order, OrderItem.</w:t>
+        <w:t>7 основних таблиць. Ключова особливість — таблиця ProductSize зберігає залишки по КОЖНОМУ розміру кожного товару (критична вимога клієнта Наталії Кобринської).</w:t>
       </w:r>
     </w:p>
+    <w:tbl>
+      <w:tblPr>
+        <w:tblStyle w:val="-11"/>
+        <w:tblW w:w="0" w:type="auto"/>
+        <w:jc w:val="center"/>
+        <w:tblLook w:val="04A0" w:firstRow="1" w:lastRow="0" w:firstColumn="1" w:lastColumn="0" w:noHBand="0" w:noVBand="1"/>
+      </w:tblPr>
+      <w:tblGrid>
+        <w:gridCol w:w="2880"/>
+        <w:gridCol w:w="2880"/>
+        <w:gridCol w:w="2880"/>
+      </w:tblGrid>
+      <w:tr>
+        <w:trPr>
+          <w:cnfStyle w:val="100000000000" w:firstRow="1" w:lastRow="0" w:firstColumn="0" w:lastColumn="0" w:oddVBand="0" w:evenVBand="0" w:oddHBand="0" w:evenHBand="0" w:firstRowFirstColumn="0" w:firstRowLastColumn="0" w:lastRowFirstColumn="0" w:lastRowLastColumn="0"/>
+          <w:jc w:val="center"/>
+        </w:trPr>
+        <w:tc>
+          <w:tcPr>
+            <w:cnfStyle w:val="001000000000" w:firstRow="0" w:lastRow="0" w:firstColumn="1" w:lastColumn="0" w:oddVBand="0" w:evenVBand="0" w:oddHBand="0" w:evenHBand="0" w:firstRowFirstColumn="0" w:firstRowLastColumn="0" w:lastRowFirstColumn="0" w:lastRowLastColumn="0"/>
+            <w:tcW w:w="2880" w:type="dxa"/>
+          </w:tcPr>
+          <w:p>
+            <w:r>
+              <w:rPr>
+                <w:sz w:val="20"/>
+              </w:rPr>
+              <w:t>Таблиця</w:t>
+            </w:r>
+          </w:p>
+        </w:tc>
+        <w:tc>
+          <w:tcPr>
+            <w:tcW w:w="2880" w:type="dxa"/>
+          </w:tcPr>
+          <w:p>
+            <w:pPr>
+              <w:cnfStyle w:val="100000000000" w:firstRow="1" w:lastRow="0" w:firstColumn="0" w:lastColumn="0" w:oddVBand="0" w:evenVBand="0" w:oddHBand="0" w:evenHBand="0" w:firstRowFirstColumn="0" w:firstRowLastColumn="0" w:lastRowFirstColumn="0" w:lastRowLastColumn="0"/>
+            </w:pPr>
+            <w:r>
+              <w:rPr>
+                <w:sz w:val="20"/>
+              </w:rPr>
+              <w:t>Призначення</w:t>
+            </w:r>
+          </w:p>
+        </w:tc>
+        <w:tc>
+          <w:tcPr>
+            <w:tcW w:w="2880" w:type="dxa"/>
+          </w:tcPr>
+          <w:p>
+            <w:pPr>
+              <w:cnfStyle w:val="100000000000" w:firstRow="1" w:lastRow="0" w:firstColumn="0" w:lastColumn="0" w:oddVBand="0" w:evenVBand="0" w:oddHBand="0" w:evenHBand="0" w:firstRowFirstColumn="0" w:firstRowLastColumn="0" w:lastRowFirstColumn="0" w:lastRowLastColumn="0"/>
+            </w:pPr>
+            <w:r>
+              <w:rPr>
+                <w:sz w:val="20"/>
+              </w:rPr>
+              <w:t>Ключові поля</w:t>
+            </w:r>
+          </w:p>
+        </w:tc>
+      </w:tr>
+      <w:tr>
+        <w:trPr>
+          <w:cnfStyle w:val="000000100000" w:firstRow="0" w:lastRow="0" w:firstColumn="0" w:lastColumn="0" w:oddVBand="0" w:evenVBand="0" w:oddHBand="1" w:evenHBand="0" w:firstRowFirstColumn="0" w:firstRowLastColumn="0" w:lastRowFirstColumn="0" w:lastRowLastColumn="0"/>
+          <w:jc w:val="center"/>
+        </w:trPr>
+        <w:tc>
+          <w:tcPr>
+            <w:cnfStyle w:val="001000000000" w:firstRow="0" w:lastRow="0" w:firstColumn="1" w:lastColumn="0" w:oddVBand="0" w:evenVBand="0" w:oddHBand="0" w:evenHBand="0" w:firstRowFirstColumn="0" w:firstRowLastColumn="0" w:lastRowFirstColumn="0" w:lastRowLastColumn="0"/>
+            <w:tcW w:w="2880" w:type="dxa"/>
+          </w:tcPr>
+          <w:p>
+            <w:r>
+              <w:rPr>
+                <w:sz w:val="20"/>
+              </w:rPr>
+              <w:t>Category</w:t>
+            </w:r>
+          </w:p>
+        </w:tc>
+        <w:tc>
+          <w:tcPr>
+            <w:tcW w:w="2880" w:type="dxa"/>
+          </w:tcPr>
+          <w:p>
+            <w:pPr>
+              <w:cnfStyle w:val="000000100000" w:firstRow="0" w:lastRow="0" w:firstColumn="0" w:lastColumn="0" w:oddVBand="0" w:evenVBand="0" w:oddHBand="1" w:evenHBand="0" w:firstRowFirstColumn="0" w:firstRowLastColumn="0" w:lastRowFirstColumn="0" w:lastRowLastColumn="0"/>
+            </w:pPr>
+            <w:r>
+              <w:rPr>
+                <w:sz w:val="20"/>
+              </w:rPr>
+              <w:t>Категорії взуття</w:t>
+            </w:r>
+          </w:p>
+        </w:tc>
+        <w:tc>
+          <w:tcPr>
+            <w:tcW w:w="2880" w:type="dxa"/>
+          </w:tcPr>
+          <w:p>
+            <w:pPr>
+              <w:cnfStyle w:val="000000100000" w:firstRow="0" w:lastRow="0" w:firstColumn="0" w:lastColumn="0" w:oddVBand="0" w:evenVBand="0" w:oddHBand="1" w:evenHBand="0" w:firstRowFirstColumn="0" w:firstRowLastColumn="0" w:lastRowFirstColumn="0" w:lastRowLastColumn="0"/>
+            </w:pPr>
+            <w:r>
+              <w:rPr>
+                <w:sz w:val="20"/>
+              </w:rPr>
+              <w:t>name, slug, season (літнє/зимове)</w:t>
+            </w:r>
+          </w:p>
+        </w:tc>
+      </w:tr>
+      <w:tr>
+        <w:trPr>
+          <w:cnfStyle w:val="000000010000" w:firstRow="0" w:lastRow="0" w:firstColumn="0" w:lastColumn="0" w:oddVBand="0" w:evenVBand="0" w:oddHBand="0" w:evenHBand="1" w:firstRowFirstColumn="0" w:firstRowLastColumn="0" w:lastRowFirstColumn="0" w:lastRowLastColumn="0"/>
+          <w:jc w:val="center"/>
+        </w:trPr>
+        <w:tc>
+          <w:tcPr>
+            <w:cnfStyle w:val="001000000000" w:firstRow="0" w:lastRow="0" w:firstColumn="1" w:lastColumn="0" w:oddVBand="0" w:evenVBand="0" w:oddHBand="0" w:evenHBand="0" w:firstRowFirstColumn="0" w:firstRowLastColumn="0" w:lastRowFirstColumn="0" w:lastRowLastColumn="0"/>
+            <w:tcW w:w="2880" w:type="dxa"/>
+          </w:tcPr>
+          <w:p>
+            <w:r>
+              <w:rPr>
+                <w:sz w:val="20"/>
+              </w:rPr>
+              <w:t>Product</w:t>
+            </w:r>
+          </w:p>
+        </w:tc>
+        <w:tc>
+          <w:tcPr>
+            <w:tcW w:w="2880" w:type="dxa"/>
+          </w:tcPr>
+          <w:p>
+            <w:pPr>
+              <w:cnfStyle w:val="000000010000" w:firstRow="0" w:lastRow="0" w:firstColumn="0" w:lastColumn="0" w:oddVBand="0" w:evenVBand="0" w:oddHBand="0" w:evenHBand="1" w:firstRowFirstColumn="0" w:firstRowLastColumn="0" w:lastRowFirstColumn="0" w:lastRowLastColumn="0"/>
+            </w:pPr>
+            <w:r>
+              <w:rPr>
+                <w:sz w:val="20"/>
+              </w:rPr>
+              <w:t>Товари</w:t>
+            </w:r>
+          </w:p>
+        </w:tc>
+        <w:tc>
+          <w:tcPr>
+            <w:tcW w:w="2880" w:type="dxa"/>
+          </w:tcPr>
+          <w:p>
+            <w:pPr>
+              <w:cnfStyle w:val="000000010000" w:firstRow="0" w:lastRow="0" w:firstColumn="0" w:lastColumn="0" w:oddVBand="0" w:evenVBand="0" w:oddHBand="0" w:evenHBand="1" w:firstRowFirstColumn="0" w:firstRowLastColumn="0" w:lastRowFirstColumn="0" w:lastRowLastColumn="0"/>
+            </w:pPr>
+            <w:r>
+              <w:rPr>
+                <w:sz w:val="20"/>
+              </w:rPr>
+              <w:t>name, price, material, images[], category_id</w:t>
+            </w:r>
+          </w:p>
+        </w:tc>
+      </w:tr>
+      <w:tr>
+        <w:trPr>
+          <w:cnfStyle w:val="000000100000" w:firstRow="0" w:lastRow="0" w:firstColumn="0" w:lastColumn="0" w:oddVBand="0" w:evenVBand="0" w:oddHBand="1" w:evenHBand="0" w:firstRowFirstColumn="0" w:firstRowLastColumn="0" w:lastRowFirstColumn="0" w:lastRowLastColumn="0"/>
+          <w:jc w:val="center"/>
+        </w:trPr>
+        <w:tc>
+          <w:tcPr>
+            <w:cnfStyle w:val="001000000000" w:firstRow="0" w:lastRow="0" w:firstColumn="1" w:lastColumn="0" w:oddVBand="0" w:evenVBand="0" w:oddHBand="0" w:evenHBand="0" w:firstRowFirstColumn="0" w:firstRowLastColumn="0" w:lastRowFirstColumn="0" w:lastRowLastColumn="0"/>
+            <w:tcW w:w="2880" w:type="dxa"/>
+          </w:tcPr>
+          <w:p>
+            <w:r>
+              <w:rPr>
+                <w:sz w:val="20"/>
+              </w:rPr>
+              <w:t>ProductSize</w:t>
+            </w:r>
+          </w:p>
+        </w:tc>
+        <w:tc>
+          <w:tcPr>
+            <w:tcW w:w="2880" w:type="dxa"/>
+          </w:tcPr>
+          <w:p>
+            <w:pPr>
+              <w:cnfStyle w:val="000000100000" w:firstRow="0" w:lastRow="0" w:firstColumn="0" w:lastColumn="0" w:oddVBand="0" w:evenVBand="0" w:oddHBand="1" w:evenHBand="0" w:firstRowFirstColumn="0" w:firstRowLastColumn="0" w:lastRowFirstColumn="0" w:lastRowLastColumn="0"/>
+            </w:pPr>
+            <w:r>
+              <w:rPr>
+                <w:sz w:val="20"/>
+              </w:rPr>
+              <w:t>Залишки по розмірах</w:t>
+            </w:r>
+          </w:p>
+        </w:tc>
+        <w:tc>
+          <w:tcPr>
+            <w:tcW w:w="2880" w:type="dxa"/>
+          </w:tcPr>
+          <w:p>
+            <w:pPr>
+              <w:cnfStyle w:val="000000100000" w:firstRow="0" w:lastRow="0" w:firstColumn="0" w:lastColumn="0" w:oddVBand="0" w:evenVBand="0" w:oddHBand="1" w:evenHBand="0" w:firstRowFirstColumn="0" w:firstRowLastColumn="0" w:lastRowFirstColumn="0" w:lastRowLastColumn="0"/>
+            </w:pPr>
+            <w:r>
+              <w:rPr>
+                <w:sz w:val="20"/>
+              </w:rPr>
+              <w:t>product_id, size (35-46), quantity</w:t>
+            </w:r>
+          </w:p>
+        </w:tc>
+      </w:tr>
+      <w:tr>
+        <w:trPr>
+          <w:cnfStyle w:val="000000010000" w:firstRow="0" w:lastRow="0" w:firstColumn="0" w:lastColumn="0" w:oddVBand="0" w:evenVBand="0" w:oddHBand="0" w:evenHBand="1" w:firstRowFirstColumn="0" w:firstRowLastColumn="0" w:lastRowFirstColumn="0" w:lastRowLastColumn="0"/>
+          <w:jc w:val="center"/>
+        </w:trPr>
+        <w:tc>
+          <w:tcPr>
+            <w:cnfStyle w:val="001000000000" w:firstRow="0" w:lastRow="0" w:firstColumn="1" w:lastColumn="0" w:oddVBand="0" w:evenVBand="0" w:oddHBand="0" w:evenHBand="0" w:firstRowFirstColumn="0" w:firstRowLastColumn="0" w:lastRowFirstColumn="0" w:lastRowLastColumn="0"/>
+            <w:tcW w:w="2880" w:type="dxa"/>
+          </w:tcPr>
+          <w:p>
+            <w:r>
+              <w:rPr>
+                <w:sz w:val="20"/>
+              </w:rPr>
+              <w:t>User</w:t>
+            </w:r>
+          </w:p>
+        </w:tc>
+        <w:tc>
+          <w:tcPr>
+            <w:tcW w:w="2880" w:type="dxa"/>
+          </w:tcPr>
+          <w:p>
+            <w:pPr>
+              <w:cnfStyle w:val="000000010000" w:firstRow="0" w:lastRow="0" w:firstColumn="0" w:lastColumn="0" w:oddVBand="0" w:evenVBand="0" w:oddHBand="0" w:evenHBand="1" w:firstRowFirstColumn="0" w:firstRowLastColumn="0" w:lastRowFirstColumn="0" w:lastRowLastColumn="0"/>
+            </w:pPr>
+            <w:r>
+              <w:rPr>
+                <w:sz w:val="20"/>
+              </w:rPr>
+              <w:t>Користувачі</w:t>
+            </w:r>
+          </w:p>
+        </w:tc>
+        <w:tc>
+          <w:tcPr>
+            <w:tcW w:w="2880" w:type="dxa"/>
+          </w:tcPr>
+          <w:p>
+            <w:pPr>
+              <w:cnfStyle w:val="000000010000" w:firstRow="0" w:lastRow="0" w:firstColumn="0" w:lastColumn="0" w:oddVBand="0" w:evenVBand="0" w:oddHBand="0" w:evenHBand="1" w:firstRowFirstColumn="0" w:firstRowLastColumn="0" w:lastRowFirstColumn="0" w:lastRowLastColumn="0"/>
+            </w:pPr>
+            <w:r>
+              <w:rPr>
+                <w:sz w:val="20"/>
+              </w:rPr>
+              <w:t>email, phone, role (buyer/manager/admin)</w:t>
+            </w:r>
+          </w:p>
+        </w:tc>
+      </w:tr>
+      <w:tr>
+        <w:trPr>
+          <w:cnfStyle w:val="000000100000" w:firstRow="0" w:lastRow="0" w:firstColumn="0" w:lastColumn="0" w:oddVBand="0" w:evenVBand="0" w:oddHBand="1" w:evenHBand="0" w:firstRowFirstColumn="0" w:firstRowLastColumn="0" w:lastRowFirstColumn="0" w:lastRowLastColumn="0"/>
+          <w:jc w:val="center"/>
+        </w:trPr>
+        <w:tc>
+          <w:tcPr>
+            <w:cnfStyle w:val="001000000000" w:firstRow="0" w:lastRow="0" w:firstColumn="1" w:lastColumn="0" w:oddVBand="0" w:evenVBand="0" w:oddHBand="0" w:evenHBand="0" w:firstRowFirstColumn="0" w:firstRowLastColumn="0" w:lastRowFirstColumn="0" w:lastRowLastColumn="0"/>
+            <w:tcW w:w="2880" w:type="dxa"/>
+          </w:tcPr>
+          <w:p>
+            <w:r>
+              <w:rPr>
+                <w:sz w:val="20"/>
+              </w:rPr>
+              <w:t>Order</w:t>
+            </w:r>
+          </w:p>
+        </w:tc>
+        <w:tc>
+          <w:tcPr>
+            <w:tcW w:w="2880" w:type="dxa"/>
+          </w:tcPr>
+          <w:p>
+            <w:pPr>
+              <w:cnfStyle w:val="000000100000" w:firstRow="0" w:lastRow="0" w:firstColumn="0" w:lastColumn="0" w:oddVBand="0" w:evenVBand="0" w:oddHBand="1" w:evenHBand="0" w:firstRowFirstColumn="0" w:firstRowLastColumn="0" w:lastRowFirstColumn="0" w:lastRowLastColumn="0"/>
+            </w:pPr>
+            <w:r>
+              <w:rPr>
+                <w:sz w:val="20"/>
+              </w:rPr>
+              <w:t>Замовлення</w:t>
+            </w:r>
+          </w:p>
+        </w:tc>
+        <w:tc>
+          <w:tcPr>
+            <w:tcW w:w="2880" w:type="dxa"/>
+          </w:tcPr>
+          <w:p>
+            <w:pPr>
+              <w:cnfStyle w:val="000000100000" w:firstRow="0" w:lastRow="0" w:firstColumn="0" w:lastColumn="0" w:oddVBand="0" w:evenVBand="0" w:oddHBand="1" w:evenHBand="0" w:firstRowFirstColumn="0" w:firstRowLastColumn="0" w:lastRowFirstColumn="0" w:lastRowLastColumn="0"/>
+            </w:pPr>
+            <w:r>
+              <w:rPr>
+                <w:sz w:val="20"/>
+              </w:rPr>
+              <w:t>status, payment_</w:t>
+            </w:r>
+            <w:r>
+              <w:rPr>
+                <w:sz w:val="20"/>
+              </w:rPr>
+              <w:t>method, delivery_method, total</w:t>
+            </w:r>
+          </w:p>
+        </w:tc>
+      </w:tr>
+      <w:tr>
+        <w:trPr>
+          <w:cnfStyle w:val="000000010000" w:firstRow="0" w:lastRow="0" w:firstColumn="0" w:lastColumn="0" w:oddVBand="0" w:evenVBand="0" w:oddHBand="0" w:evenHBand="1" w:firstRowFirstColumn="0" w:firstRowLastColumn="0" w:lastRowFirstColumn="0" w:lastRowLastColumn="0"/>
+          <w:jc w:val="center"/>
+        </w:trPr>
+        <w:tc>
+          <w:tcPr>
+            <w:cnfStyle w:val="001000000000" w:firstRow="0" w:lastRow="0" w:firstColumn="1" w:lastColumn="0" w:oddVBand="0" w:evenVBand="0" w:oddHBand="0" w:evenHBand="0" w:firstRowFirstColumn="0" w:firstRowLastColumn="0" w:lastRowFirstColumn="0" w:lastRowLastColumn="0"/>
+            <w:tcW w:w="2880" w:type="dxa"/>
+          </w:tcPr>
+          <w:p>
+            <w:r>
+              <w:rPr>
+                <w:sz w:val="20"/>
+              </w:rPr>
+              <w:t>OrderItem</w:t>
+            </w:r>
+          </w:p>
+        </w:tc>
+        <w:tc>
+          <w:tcPr>
+            <w:tcW w:w="2880" w:type="dxa"/>
+          </w:tcPr>
+          <w:p>
+            <w:pPr>
+              <w:cnfStyle w:val="000000010000" w:firstRow="0" w:lastRow="0" w:firstColumn="0" w:lastColumn="0" w:oddVBand="0" w:evenVBand="0" w:oddHBand="0" w:evenHBand="1" w:firstRowFirstColumn="0" w:firstRowLastColumn="0" w:lastRowFirstColumn="0" w:lastRowLastColumn="0"/>
+            </w:pPr>
+            <w:r>
+              <w:rPr>
+                <w:sz w:val="20"/>
+              </w:rPr>
+              <w:t>Позиції замовлення</w:t>
+            </w:r>
+          </w:p>
+        </w:tc>
+        <w:tc>
+          <w:tcPr>
+            <w:tcW w:w="2880" w:type="dxa"/>
+          </w:tcPr>
+          <w:p>
+            <w:pPr>
+              <w:cnfStyle w:val="000000010000" w:firstRow="0" w:lastRow="0" w:firstColumn="0" w:lastColumn="0" w:oddVBand="0" w:evenVBand="0" w:oddHBand="0" w:evenHBand="1" w:firstRowFirstColumn="0" w:firstRowLastColumn="0" w:lastRowFirstColumn="0" w:lastRowLastColumn="0"/>
+            </w:pPr>
+            <w:r>
+              <w:rPr>
+                <w:sz w:val="20"/>
+              </w:rPr>
+              <w:t>order_id, product_id, size, quantity, price</w:t>
+            </w:r>
+          </w:p>
+        </w:tc>
+      </w:tr>
+      <w:tr>
+        <w:trPr>
+          <w:cnfStyle w:val="000000100000" w:firstRow="0" w:lastRow="0" w:firstColumn="0" w:lastColumn="0" w:oddVBand="0" w:evenVBand="0" w:oddHBand="1" w:evenHBand="0" w:firstRowFirstColumn="0" w:firstRowLastColumn="0" w:lastRowFirstColumn="0" w:lastRowLastColumn="0"/>
+          <w:jc w:val="center"/>
+        </w:trPr>
+        <w:tc>
+          <w:tcPr>
+            <w:cnfStyle w:val="001000000000" w:firstRow="0" w:lastRow="0" w:firstColumn="1" w:lastColumn="0" w:oddVBand="0" w:evenVBand="0" w:oddHBand="0" w:evenHBand="0" w:firstRowFirstColumn="0" w:firstRowLastColumn="0" w:lastRowFirstColumn="0" w:lastRowLastColumn="0"/>
+            <w:tcW w:w="2880" w:type="dxa"/>
+          </w:tcPr>
+          <w:p>
+            <w:r>
+              <w:rPr>
+                <w:sz w:val="20"/>
+              </w:rPr>
+              <w:t>ProductVariant</w:t>
+            </w:r>
+          </w:p>
+        </w:tc>
+        <w:tc>
+          <w:tcPr>
+            <w:tcW w:w="2880" w:type="dxa"/>
+          </w:tcPr>
+          <w:p>
+            <w:pPr>
+              <w:cnfStyle w:val="000000100000" w:firstRow="0" w:lastRow="0" w:firstColumn="0" w:lastColumn="0" w:oddVBand="0" w:evenVBand="0" w:oddHBand="1" w:evenHBand="0" w:firstRowFirstColumn="0" w:firstRowLastColumn="0" w:lastRowFirstColumn="0" w:lastRowLastColumn="0"/>
+            </w:pPr>
+            <w:r>
+              <w:rPr>
+                <w:sz w:val="20"/>
+              </w:rPr>
+              <w:t>Конструктор (Фаза 2)</w:t>
+            </w:r>
+          </w:p>
+        </w:tc>
+        <w:tc>
+          <w:tcPr>
+            <w:tcW w:w="2880" w:type="dxa"/>
+          </w:tcPr>
+          <w:p>
+            <w:pPr>
+              <w:cnfStyle w:val="000000100000" w:firstRow="0" w:lastRow="0" w:firstColumn="0" w:lastColumn="0" w:oddVBand="0" w:evenVBand="0" w:oddHBand="1" w:evenHBand="0" w:firstRowFirstColumn="0" w:firstRowLastColumn="0" w:lastRowFirstColumn="0" w:lastRowLastColumn="0"/>
+            </w:pPr>
+            <w:r>
+              <w:rPr>
+                <w:sz w:val="20"/>
+              </w:rPr>
+              <w:t>sole_type, material, lining, color</w:t>
+            </w:r>
+          </w:p>
+        </w:tc>
+      </w:tr>
+    </w:tbl>
+    <w:p/>
     <w:p>
       <w:r>
         <w:rPr>
           <w:i/>
         </w:rPr>
-        <w:t>⚠️ Таблиця ProductVariant закладена для Фази 2 (конструктор взуття), але НЕ реалізується в MVP.</w:t>
+        <w:t xml:space="preserve">Таблиця ProductVariant НЕ реалізується в MVP, але закладена в схему для Фази </w:t>
+      </w:r>
+      <w:r>
+        <w:rPr>
+          <w:i/>
+        </w:rPr>
+        <w:t>2 (конструктор взуття).</w:t>
       </w:r>
     </w:p>
     <w:p>
@@ -227,10 +711,9 @@
           <w:noProof/>
           <w:lang w:val="ru-RU" w:eastAsia="ru-RU"/>
         </w:rPr>
-        <w:lastRenderedPageBreak/>
         <w:drawing>
           <wp:inline distT="0" distB="0" distL="0" distR="0">
-            <wp:extent cx="6273784" cy="5543550"/>
+            <wp:extent cx="5029200" cy="4443829"/>
             <wp:effectExtent l="0" t="0" r="0" b="0"/>
             <wp:docPr id="3" name="Picture 3"/>
             <wp:cNvGraphicFramePr>
@@ -252,7 +735,7 @@
                   <pic:spPr>
                     <a:xfrm>
                       <a:off x="0" y="0"/>
-                      <a:ext cx="6277173" cy="5546545"/>
+                      <a:ext cx="5029200" cy="4443829"/>
                     </a:xfrm>
                     <a:prstGeom prst="rect">
                       <a:avLst/>
@@ -279,7 +762,40 @@
     </w:p>
     <w:p>
       <w:r>
-        <w:t>Повний шлях покупця: каталог → картка товару → кошик → оформлення → оплата → доставка.</w:t>
+        <w:t>Повний шлях покупця від каталогу до підтвердження замовлення:</w:t>
+      </w:r>
+    </w:p>
+    <w:p>
+      <w:r>
+        <w:t>1. Покупець відкриває каталог -&gt; фільтрує за розміром/категорією/ціною</w:t>
+      </w:r>
+    </w:p>
+    <w:p>
+      <w:r>
+        <w:t>2. Відкриває картку товару -&gt; бачить фото, наявність розмірів</w:t>
+      </w:r>
+      <w:r>
+        <w:t>, розмірну сітку</w:t>
+      </w:r>
+    </w:p>
+    <w:p>
+      <w:r>
+        <w:t>3. Додає товар у кошик -&gt; оформлює замовлення (ПІБ, телефон, адреса)</w:t>
+      </w:r>
+    </w:p>
+    <w:p>
+      <w:r>
+        <w:t>4. Обирає оплату (LiqPay карткою або накладений платіж)</w:t>
+      </w:r>
+    </w:p>
+    <w:p>
+      <w:r>
+        <w:t>5. Обирає доставку (Нова Пошта відділення або кур'єр)</w:t>
+      </w:r>
+    </w:p>
+    <w:p>
+      <w:r>
+        <w:t>6. Отримує підтвердження з номером ТТН</w:t>
       </w:r>
     </w:p>
     <w:p>
@@ -294,8 +810,8 @@
         <w:lastRenderedPageBreak/>
         <w:drawing>
           <wp:inline distT="0" distB="0" distL="0" distR="0">
-            <wp:extent cx="5991225" cy="5001604"/>
-            <wp:effectExtent l="0" t="0" r="0" b="8890"/>
+            <wp:extent cx="5029200" cy="4198484"/>
+            <wp:effectExtent l="0" t="0" r="0" b="0"/>
             <wp:docPr id="4" name="Picture 4"/>
             <wp:cNvGraphicFramePr>
               <a:graphicFrameLocks xmlns:a="http://schemas.openxmlformats.org/drawingml/2006/main" noChangeAspect="1"/>
@@ -316,7 +832,7 @@
                   <pic:spPr>
                     <a:xfrm>
                       <a:off x="0" y="0"/>
-                      <a:ext cx="5995649" cy="5005297"/>
+                      <a:ext cx="5029200" cy="4198484"/>
                     </a:xfrm>
                     <a:prstGeom prst="rect">
                       <a:avLst/>
@@ -338,7 +854,13 @@
         <w:rPr>
           <w:color w:val="1A1A2E"/>
         </w:rPr>
-        <w:t>5. Обраний технологічний стек</w:t>
+        <w:t>5. Технологічний с</w:t>
+      </w:r>
+      <w:r>
+        <w:rPr>
+          <w:color w:val="1A1A2E"/>
+        </w:rPr>
+        <w:t>тек</w:t>
       </w:r>
     </w:p>
     <w:tbl>
@@ -436,7 +958,7 @@
               <w:rPr>
                 <w:sz w:val="20"/>
               </w:rPr>
-              <w:t>Next.js (React)</w:t>
+              <w:t>Next.js 14 (React)</w:t>
             </w:r>
           </w:p>
         </w:tc>
@@ -452,7 +974,7 @@
               <w:rPr>
                 <w:sz w:val="20"/>
               </w:rPr>
-              <w:t>SSR для SEO каталогу</w:t>
+              <w:t>SSR для SEO, App Router, великий ecosystem</w:t>
             </w:r>
           </w:p>
         </w:tc>
@@ -472,7 +994,7 @@
               <w:rPr>
                 <w:sz w:val="20"/>
               </w:rPr>
-              <w:t>CSS</w:t>
+              <w:t>CSS Framework</w:t>
             </w:r>
           </w:p>
         </w:tc>
@@ -504,7 +1026,7 @@
               <w:rPr>
                 <w:sz w:val="20"/>
               </w:rPr>
-              <w:t>Швидка розробка адаптивного UI</w:t>
+              <w:t>Utility-first, швидка адаптивна розробка</w:t>
             </w:r>
           </w:p>
         </w:tc>
@@ -556,7 +1078,7 @@
               <w:rPr>
                 <w:sz w:val="20"/>
               </w:rPr>
-              <w:t>Єдина мова JS/TS</w:t>
+              <w:t>Єдина мова JS/TS для full-stack</w:t>
             </w:r>
           </w:p>
         </w:tc>
@@ -608,7 +1130,7 @@
               <w:rPr>
                 <w:sz w:val="20"/>
               </w:rPr>
-              <w:t>Типізація, міграції</w:t>
+              <w:t>TypeScript-типізація, автоматичні міграції</w:t>
             </w:r>
           </w:p>
         </w:tc>
@@ -660,7 +1182,7 @@
               <w:rPr>
                 <w:sz w:val="20"/>
               </w:rPr>
-              <w:t>Надійна, безкоштовна</w:t>
+              <w:t>ACID, надійна, підтримка JSON для варіантів</w:t>
             </w:r>
           </w:p>
         </w:tc>
@@ -712,7 +1234,7 @@
               <w:rPr>
                 <w:sz w:val="20"/>
               </w:rPr>
-              <w:t>Швидкий доступ до залишків</w:t>
+              <w:t>In-memory, швидкий доступ до залишків складу</w:t>
             </w:r>
           </w:p>
         </w:tc>
@@ -732,7 +1254,7 @@
               <w:rPr>
                 <w:sz w:val="20"/>
               </w:rPr>
-              <w:t>Фото</w:t>
+              <w:t>Фото товарів</w:t>
             </w:r>
           </w:p>
         </w:tc>
@@ -764,7 +1286,7 @@
               <w:rPr>
                 <w:sz w:val="20"/>
               </w:rPr>
-              <w:t>Зберігання та оптимізація</w:t>
+              <w:t>CDN, автоматична оптимізація, free tier 25GB</w:t>
             </w:r>
           </w:p>
         </w:tc>
@@ -816,7 +1338,7 @@
               <w:rPr>
                 <w:sz w:val="20"/>
               </w:rPr>
-              <w:t>Найпоширеніший в Україні</w:t>
+              <w:t>Найпоширеніший платіжний шлюз в Україні</w:t>
             </w:r>
           </w:p>
         </w:tc>
@@ -852,7 +1374,7 @@
               <w:rPr>
                 <w:sz w:val="20"/>
               </w:rPr>
-              <w:t>Нова Пошта API</w:t>
+              <w:t>Нова Пошта API v2</w:t>
             </w:r>
           </w:p>
         </w:tc>
@@ -868,7 +1390,7 @@
               <w:rPr>
                 <w:sz w:val="20"/>
               </w:rPr>
-              <w:t>Офіційний API</w:t>
+              <w:t>Офіційний API: пошук відділень, створення ТТН</w:t>
             </w:r>
           </w:p>
         </w:tc>
@@ -920,7 +1442,7 @@
               <w:rPr>
                 <w:sz w:val="20"/>
               </w:rPr>
-              <w:t>Безкоштовний</w:t>
+              <w:t>Безкоштовний, легка інтеграція (скрипт)</w:t>
             </w:r>
           </w:p>
         </w:tc>
@@ -940,7 +1462,8 @@
               <w:rPr>
                 <w:sz w:val="20"/>
               </w:rPr>
-              <w:t>Хостинг</w:t>
+              <w:lastRenderedPageBreak/>
+              <w:t>Хостинг Frontend</w:t>
             </w:r>
           </w:p>
         </w:tc>
@@ -956,7 +1479,7 @@
               <w:rPr>
                 <w:sz w:val="20"/>
               </w:rPr>
-              <w:t>Vercel + Render</w:t>
+              <w:t>Vercel (Hobby)</w:t>
             </w:r>
           </w:p>
         </w:tc>
@@ -972,7 +1495,13 @@
               <w:rPr>
                 <w:sz w:val="20"/>
               </w:rPr>
-              <w:t>Free tiers для MVP</w:t>
+              <w:t xml:space="preserve">Zero-config для </w:t>
+            </w:r>
+            <w:r>
+              <w:rPr>
+                <w:sz w:val="20"/>
+              </w:rPr>
+              <w:t>Next.js, auto SSL</w:t>
             </w:r>
           </w:p>
         </w:tc>
@@ -980,6 +1509,58 @@
       <w:tr>
         <w:trPr>
           <w:cnfStyle w:val="000000010000" w:firstRow="0" w:lastRow="0" w:firstColumn="0" w:lastColumn="0" w:oddVBand="0" w:evenVBand="0" w:oddHBand="0" w:evenHBand="1" w:firstRowFirstColumn="0" w:firstRowLastColumn="0" w:lastRowFirstColumn="0" w:lastRowLastColumn="0"/>
+          <w:jc w:val="center"/>
+        </w:trPr>
+        <w:tc>
+          <w:tcPr>
+            <w:cnfStyle w:val="001000000000" w:firstRow="0" w:lastRow="0" w:firstColumn="1" w:lastColumn="0" w:oddVBand="0" w:evenVBand="0" w:oddHBand="0" w:evenHBand="0" w:firstRowFirstColumn="0" w:firstRowLastColumn="0" w:lastRowFirstColumn="0" w:lastRowLastColumn="0"/>
+            <w:tcW w:w="2880" w:type="dxa"/>
+          </w:tcPr>
+          <w:p>
+            <w:r>
+              <w:rPr>
+                <w:sz w:val="20"/>
+              </w:rPr>
+              <w:t>Хостинг Backend</w:t>
+            </w:r>
+          </w:p>
+        </w:tc>
+        <w:tc>
+          <w:tcPr>
+            <w:tcW w:w="2880" w:type="dxa"/>
+          </w:tcPr>
+          <w:p>
+            <w:pPr>
+              <w:cnfStyle w:val="000000010000" w:firstRow="0" w:lastRow="0" w:firstColumn="0" w:lastColumn="0" w:oddVBand="0" w:evenVBand="0" w:oddHBand="0" w:evenHBand="1" w:firstRowFirstColumn="0" w:firstRowLastColumn="0" w:lastRowFirstColumn="0" w:lastRowLastColumn="0"/>
+            </w:pPr>
+            <w:r>
+              <w:rPr>
+                <w:sz w:val="20"/>
+              </w:rPr>
+              <w:t>Railway або Render</w:t>
+            </w:r>
+          </w:p>
+        </w:tc>
+        <w:tc>
+          <w:tcPr>
+            <w:tcW w:w="2880" w:type="dxa"/>
+          </w:tcPr>
+          <w:p>
+            <w:pPr>
+              <w:cnfStyle w:val="000000010000" w:firstRow="0" w:lastRow="0" w:firstColumn="0" w:lastColumn="0" w:oddVBand="0" w:evenVBand="0" w:oddHBand="0" w:evenHBand="1" w:firstRowFirstColumn="0" w:firstRowLastColumn="0" w:lastRowFirstColumn="0" w:lastRowLastColumn="0"/>
+            </w:pPr>
+            <w:r>
+              <w:rPr>
+                <w:sz w:val="20"/>
+              </w:rPr>
+              <w:t>Free tier достатній для MVP</w:t>
+            </w:r>
+          </w:p>
+        </w:tc>
+      </w:tr>
+      <w:tr>
+        <w:trPr>
+          <w:cnfStyle w:val="000000100000" w:firstRow="0" w:lastRow="0" w:firstColumn="0" w:lastColumn="0" w:oddVBand="0" w:evenVBand="0" w:oddHBand="1" w:evenHBand="0" w:firstRowFirstColumn="0" w:firstRowLastColumn="0" w:lastRowFirstColumn="0" w:lastRowLastColumn="0"/>
           <w:jc w:val="center"/>
         </w:trPr>
         <w:tc>
@@ -1002,13 +1583,13 @@
           </w:tcPr>
           <w:p>
             <w:pPr>
-              <w:cnfStyle w:val="000000010000" w:firstRow="0" w:lastRow="0" w:firstColumn="0" w:lastColumn="0" w:oddVBand="0" w:evenVBand="0" w:oddHBand="0" w:evenHBand="1" w:firstRowFirstColumn="0" w:firstRowLastColumn="0" w:lastRowFirstColumn="0" w:lastRowLastColumn="0"/>
+              <w:cnfStyle w:val="000000100000" w:firstRow="0" w:lastRow="0" w:firstColumn="0" w:lastColumn="0" w:oddVBand="0" w:evenVBand="0" w:oddHBand="1" w:evenHBand="0" w:firstRowFirstColumn="0" w:firstRowLastColumn="0" w:lastRowFirstColumn="0" w:lastRowLastColumn="0"/>
             </w:pPr>
             <w:r>
               <w:rPr>
                 <w:sz w:val="20"/>
               </w:rPr>
-              <w:t>.ua (Hostiq)</w:t>
+              <w:t>.ua через Hostiq</w:t>
             </w:r>
           </w:p>
         </w:tc>
@@ -1018,18 +1599,19 @@
           </w:tcPr>
           <w:p>
             <w:pPr>
-              <w:cnfStyle w:val="000000010000" w:firstRow="0" w:lastRow="0" w:firstColumn="0" w:lastColumn="0" w:oddVBand="0" w:evenVBand="0" w:oddHBand="0" w:evenHBand="1" w:firstRowFirstColumn="0" w:firstRowLastColumn="0" w:lastRowFirstColumn="0" w:lastRowLastColumn="0"/>
+              <w:cnfStyle w:val="000000100000" w:firstRow="0" w:lastRow="0" w:firstColumn="0" w:lastColumn="0" w:oddVBand="0" w:evenVBand="0" w:oddHBand="1" w:evenHBand="0" w:firstRowFirstColumn="0" w:firstRowLastColumn="0" w:lastRowFirstColumn="0" w:lastRowLastColumn="0"/>
             </w:pPr>
             <w:r>
               <w:rPr>
                 <w:sz w:val="20"/>
               </w:rPr>
-              <w:t>Географічна прив'язка</w:t>
+              <w:t>Географічна прив'язка до UA ринку</w:t>
             </w:r>
           </w:p>
         </w:tc>
       </w:tr>
     </w:tbl>
+    <w:p/>
     <w:p>
       <w:pPr>
         <w:pStyle w:val="21"/>
@@ -1038,7 +1620,6 @@
         <w:rPr>
           <w:color w:val="1A1A2E"/>
         </w:rPr>
-        <w:lastRenderedPageBreak/>
         <w:t>6. Ключові архітектурні рішення</w:t>
       </w:r>
     </w:p>
@@ -1055,17 +1636,33 @@
     </w:p>
     <w:p>
       <w:r>
-        <w:t>• Наявність у таблиці ProductSize (запис для кожного розміру кожного товару).</w:t>
+        <w:t xml:space="preserve">Вимога клієнта: покупець має бачити наявність </w:t>
+      </w:r>
+      <w:r>
+        <w:t>КОЖНОГО розміру без запиту через Instagram.</w:t>
       </w:r>
     </w:p>
     <w:p>
       <w:r>
-        <w:t>• При замовленні quantity зменшується автоматично.</w:t>
+        <w:t xml:space="preserve">  - Окрема таблиця ProductSize (product_id + size + quantity)</w:t>
       </w:r>
     </w:p>
     <w:p>
       <w:r>
-        <w:t>• quantity = 0 → розмір показується як «Немає в наявності».</w:t>
+        <w:t xml:space="preserve">  - При оформленні замовлення quantity зменшується атомарно (транзакція)</w:t>
+      </w:r>
+    </w:p>
+    <w:p>
+      <w:r>
+        <w:t xml:space="preserve">  - quantity = 0 -&gt; розмір відображається як 'Немає в наявності'</w:t>
+      </w:r>
+    </w:p>
+    <w:p>
+      <w:r>
+        <w:t xml:space="preserve">  - Менеджер</w:t>
+      </w:r>
+      <w:r>
+        <w:t xml:space="preserve"> оновлює залишки через адмін-панель без виходу на склад</w:t>
       </w:r>
     </w:p>
     <w:p>
@@ -1076,17 +1673,30 @@
         <w:rPr>
           <w:color w:val="1A1A2E"/>
         </w:rPr>
-        <w:t>6.2. Підготовка до конструктора (Фаза 2)</w:t>
+        <w:t>6.2. Готовність до конструктора (Фаза 2)</w:t>
       </w:r>
     </w:p>
     <w:p>
       <w:r>
-        <w:t>• Таблиця ProductVariant закладена в ER-схему, але не реалізується в MVP.</w:t>
+        <w:t>Клієнт планує (Фаза 2): покупець зможе обрати підошву, матеріал верху, підклад та колір.</w:t>
       </w:r>
     </w:p>
     <w:p>
       <w:r>
-        <w:t>• Комбінації: підошва × матеріал × підклад × колір.</w:t>
+        <w:t xml:space="preserve">  - Таблиця ProductVariant вже закладена в ER-схему</w:t>
+      </w:r>
+    </w:p>
+    <w:p>
+      <w:r>
+        <w:t xml:space="preserve">  - API побудовано</w:t>
+      </w:r>
+      <w:r>
+        <w:t xml:space="preserve"> з урахуванням ExtensionPoint для варіантів</w:t>
+      </w:r>
+    </w:p>
+    <w:p>
+      <w:r>
+        <w:t xml:space="preserve">  - Міграція БД не потрібна при додаванні конструктора</w:t>
       </w:r>
     </w:p>
     <w:p>
@@ -1102,12 +1712,27 @@
     </w:p>
     <w:p>
       <w:r>
-        <w:t>• Паролі — bcrypt хешування. JWT-токени для авторизації.</w:t>
+        <w:t xml:space="preserve">  - Паролі: bcrypt (cost factor 12)</w:t>
       </w:r>
     </w:p>
     <w:p>
       <w:r>
-        <w:t>• HTTPS обов'язково (SSL від Vercel / Let's Encrypt).</w:t>
+        <w:t xml:space="preserve">  - Авторизація: JWT (access + refresh tokens)</w:t>
+      </w:r>
+    </w:p>
+    <w:p>
+      <w:r>
+        <w:t xml:space="preserve">  - HTTPS: SSL від Vercel (auto) / Let's Encrypt</w:t>
+      </w:r>
+    </w:p>
+    <w:p>
+      <w:r>
+        <w:t xml:space="preserve">  - SQL injection: захист через Prisma ORM (parameterized queries)</w:t>
+      </w:r>
+    </w:p>
+    <w:p>
+      <w:r>
+        <w:t xml:space="preserve">  - XSS: React автоматично екранує output</w:t>
       </w:r>
     </w:p>
     <w:p>
@@ -1118,17 +1743,25 @@
         <w:rPr>
           <w:color w:val="1A1A2E"/>
         </w:rPr>
-        <w:t>6.4. Mobile-first</w:t>
+        <w:t>6.4. Mobile-first підхід</w:t>
       </w:r>
     </w:p>
     <w:p>
       <w:r>
-        <w:t>• Більшість покупців приходять з Instagram → з телефону.</w:t>
+        <w:t>Більшість покупців LiLu приходять з Instagram -&gt; з мобільного.</w:t>
       </w:r>
     </w:p>
     <w:p>
       <w:r>
-        <w:t>• Адаптивний дизайн: мобільний → планшет → десктоп.</w:t>
+        <w:t xml:space="preserve">  - Responsive breakpoints: mobile (320px) -&gt; tablet (768px</w:t>
+      </w:r>
+      <w:r>
+        <w:t>) -&gt; desktop (1280px)</w:t>
+      </w:r>
+    </w:p>
+    <w:p>
+      <w:r>
+        <w:t xml:space="preserve">  - Touch-friendly UI: великі кнопки, свайпи в галереї фото</w:t>
       </w:r>
     </w:p>
     <w:p/>
@@ -1140,7 +1773,13 @@
         <w:rPr>
           <w:color w:val="1A1A2E"/>
         </w:rPr>
-        <w:t>7. Зовнішні інтеграції</w:t>
+        <w:lastRenderedPageBreak/>
+        <w:t>7. Зовнішні інтеграції (відповідно до Product Backlog)</w:t>
+      </w:r>
+    </w:p>
+    <w:p>
+      <w:r>
+        <w:t>Розподіл за спринтами згідно з Product Backlog BA (Покась):</w:t>
       </w:r>
     </w:p>
     <w:tbl>
@@ -1151,10 +1790,11 @@
         <w:tblLook w:val="04A0" w:firstRow="1" w:lastRow="0" w:firstColumn="1" w:lastColumn="0" w:noHBand="0" w:noVBand="1"/>
       </w:tblPr>
       <w:tblGrid>
-        <w:gridCol w:w="2160"/>
-        <w:gridCol w:w="2160"/>
-        <w:gridCol w:w="2160"/>
-        <w:gridCol w:w="2160"/>
+        <w:gridCol w:w="1728"/>
+        <w:gridCol w:w="1728"/>
+        <w:gridCol w:w="1728"/>
+        <w:gridCol w:w="1728"/>
+        <w:gridCol w:w="1728"/>
       </w:tblGrid>
       <w:tr>
         <w:trPr>
@@ -1164,7 +1804,7 @@
         <w:tc>
           <w:tcPr>
             <w:cnfStyle w:val="001000000000" w:firstRow="0" w:lastRow="0" w:firstColumn="1" w:lastColumn="0" w:oddVBand="0" w:evenVBand="0" w:oddHBand="0" w:evenHBand="0" w:firstRowFirstColumn="0" w:firstRowLastColumn="0" w:lastRowFirstColumn="0" w:lastRowLastColumn="0"/>
-            <w:tcW w:w="2160" w:type="dxa"/>
+            <w:tcW w:w="1728" w:type="dxa"/>
           </w:tcPr>
           <w:p>
             <w:r>
@@ -1177,7 +1817,7 @@
         </w:tc>
         <w:tc>
           <w:tcPr>
-            <w:tcW w:w="2160" w:type="dxa"/>
+            <w:tcW w:w="1728" w:type="dxa"/>
           </w:tcPr>
           <w:p>
             <w:pPr>
@@ -1193,7 +1833,7 @@
         </w:tc>
         <w:tc>
           <w:tcPr>
-            <w:tcW w:w="2160" w:type="dxa"/>
+            <w:tcW w:w="1728" w:type="dxa"/>
           </w:tcPr>
           <w:p>
             <w:pPr>
@@ -1203,13 +1843,13 @@
               <w:rPr>
                 <w:sz w:val="20"/>
               </w:rPr>
-              <w:t>Що робить</w:t>
+              <w:t>User Story</w:t>
             </w:r>
           </w:p>
         </w:tc>
         <w:tc>
           <w:tcPr>
-            <w:tcW w:w="2160" w:type="dxa"/>
+            <w:tcW w:w="1728" w:type="dxa"/>
           </w:tcPr>
           <w:p>
             <w:pPr>
@@ -1223,6 +1863,22 @@
             </w:r>
           </w:p>
         </w:tc>
+        <w:tc>
+          <w:tcPr>
+            <w:tcW w:w="1728" w:type="dxa"/>
+          </w:tcPr>
+          <w:p>
+            <w:pPr>
+              <w:cnfStyle w:val="100000000000" w:firstRow="1" w:lastRow="0" w:firstColumn="0" w:lastColumn="0" w:oddVBand="0" w:evenVBand="0" w:oddHBand="0" w:evenHBand="0" w:firstRowFirstColumn="0" w:firstRowLastColumn="0" w:lastRowFirstColumn="0" w:lastRowLastColumn="0"/>
+            </w:pPr>
+            <w:r>
+              <w:rPr>
+                <w:sz w:val="20"/>
+              </w:rPr>
+              <w:t>SP</w:t>
+            </w:r>
+          </w:p>
+        </w:tc>
       </w:tr>
       <w:tr>
         <w:trPr>
@@ -1232,7 +1888,259 @@
         <w:tc>
           <w:tcPr>
             <w:cnfStyle w:val="001000000000" w:firstRow="0" w:lastRow="0" w:firstColumn="1" w:lastColumn="0" w:oddVBand="0" w:evenVBand="0" w:oddHBand="0" w:evenHBand="0" w:firstRowFirstColumn="0" w:firstRowLastColumn="0" w:lastRowFirstColumn="0" w:lastRowLastColumn="0"/>
-            <w:tcW w:w="2160" w:type="dxa"/>
+            <w:tcW w:w="1728" w:type="dxa"/>
+          </w:tcPr>
+          <w:p>
+            <w:r>
+              <w:rPr>
+                <w:sz w:val="20"/>
+              </w:rPr>
+              <w:t>Каталог з фото</w:t>
+            </w:r>
+          </w:p>
+        </w:tc>
+        <w:tc>
+          <w:tcPr>
+            <w:tcW w:w="1728" w:type="dxa"/>
+          </w:tcPr>
+          <w:p>
+            <w:pPr>
+              <w:cnfStyle w:val="000000100000" w:firstRow="0" w:lastRow="0" w:firstColumn="0" w:lastColumn="0" w:oddVBand="0" w:evenVBand="0" w:oddHBand="1" w:evenHBand="0" w:firstRowFirstColumn="0" w:firstRowLastColumn="0" w:lastRowFirstColumn="0" w:lastRowLastColumn="0"/>
+            </w:pPr>
+            <w:r>
+              <w:rPr>
+                <w:sz w:val="20"/>
+              </w:rPr>
+              <w:t>Cloudinary</w:t>
+            </w:r>
+          </w:p>
+        </w:tc>
+        <w:tc>
+          <w:tcPr>
+            <w:tcW w:w="1728" w:type="dxa"/>
+          </w:tcPr>
+          <w:p>
+            <w:pPr>
+              <w:cnfStyle w:val="000000100000" w:firstRow="0" w:lastRow="0" w:firstColumn="0" w:lastColumn="0" w:oddVBand="0" w:evenVBand="0" w:oddHBand="1" w:evenHBand="0" w:firstRowFirstColumn="0" w:firstRowLastColumn="0" w:lastRowFirstColumn="0" w:lastRowLastColumn="0"/>
+            </w:pPr>
+            <w:r>
+              <w:rPr>
+                <w:sz w:val="20"/>
+              </w:rPr>
+              <w:t>US-01</w:t>
+            </w:r>
+          </w:p>
+        </w:tc>
+        <w:tc>
+          <w:tcPr>
+            <w:tcW w:w="1728" w:type="dxa"/>
+          </w:tcPr>
+          <w:p>
+            <w:pPr>
+              <w:cnfStyle w:val="000000100000" w:firstRow="0" w:lastRow="0" w:firstColumn="0" w:lastColumn="0" w:oddVBand="0" w:evenVBand="0" w:oddHBand="1" w:evenHBand="0" w:firstRowFirstColumn="0" w:firstRowLastColumn="0" w:lastRowFirstColumn="0" w:lastRowLastColumn="0"/>
+            </w:pPr>
+            <w:r>
+              <w:rPr>
+                <w:sz w:val="20"/>
+              </w:rPr>
+              <w:t>Sprint 1</w:t>
+            </w:r>
+          </w:p>
+        </w:tc>
+        <w:tc>
+          <w:tcPr>
+            <w:tcW w:w="1728" w:type="dxa"/>
+          </w:tcPr>
+          <w:p>
+            <w:pPr>
+              <w:cnfStyle w:val="000000100000" w:firstRow="0" w:lastRow="0" w:firstColumn="0" w:lastColumn="0" w:oddVBand="0" w:evenVBand="0" w:oddHBand="1" w:evenHBand="0" w:firstRowFirstColumn="0" w:firstRowLastColumn="0" w:lastRowFirstColumn="0" w:lastRowLastColumn="0"/>
+            </w:pPr>
+            <w:r>
+              <w:rPr>
+                <w:sz w:val="20"/>
+              </w:rPr>
+              <w:t>5</w:t>
+            </w:r>
+          </w:p>
+        </w:tc>
+      </w:tr>
+      <w:tr>
+        <w:trPr>
+          <w:cnfStyle w:val="000000010000" w:firstRow="0" w:lastRow="0" w:firstColumn="0" w:lastColumn="0" w:oddVBand="0" w:evenVBand="0" w:oddHBand="0" w:evenHBand="1" w:firstRowFirstColumn="0" w:firstRowLastColumn="0" w:lastRowFirstColumn="0" w:lastRowLastColumn="0"/>
+          <w:jc w:val="center"/>
+        </w:trPr>
+        <w:tc>
+          <w:tcPr>
+            <w:cnfStyle w:val="001000000000" w:firstRow="0" w:lastRow="0" w:firstColumn="1" w:lastColumn="0" w:oddVBand="0" w:evenVBand="0" w:oddHBand="0" w:evenHBand="0" w:firstRowFirstColumn="0" w:firstRowLastColumn="0" w:lastRowFirstColumn="0" w:lastRowLastColumn="0"/>
+            <w:tcW w:w="1728" w:type="dxa"/>
+          </w:tcPr>
+          <w:p>
+            <w:r>
+              <w:rPr>
+                <w:sz w:val="20"/>
+              </w:rPr>
+              <w:t>Фільтри (розмір, колір, категорія)</w:t>
+            </w:r>
+          </w:p>
+        </w:tc>
+        <w:tc>
+          <w:tcPr>
+            <w:tcW w:w="1728" w:type="dxa"/>
+          </w:tcPr>
+          <w:p>
+            <w:pPr>
+              <w:cnfStyle w:val="000000010000" w:firstRow="0" w:lastRow="0" w:firstColumn="0" w:lastColumn="0" w:oddVBand="0" w:evenVBand="0" w:oddHBand="0" w:evenHBand="1" w:firstRowFirstColumn="0" w:firstRowLastColumn="0" w:lastRowFirstColumn="0" w:lastRowLastColumn="0"/>
+            </w:pPr>
+            <w:r>
+              <w:rPr>
+                <w:sz w:val="20"/>
+              </w:rPr>
+              <w:t>Внутрішня логіка</w:t>
+            </w:r>
+          </w:p>
+        </w:tc>
+        <w:tc>
+          <w:tcPr>
+            <w:tcW w:w="1728" w:type="dxa"/>
+          </w:tcPr>
+          <w:p>
+            <w:pPr>
+              <w:cnfStyle w:val="000000010000" w:firstRow="0" w:lastRow="0" w:firstColumn="0" w:lastColumn="0" w:oddVBand="0" w:evenVBand="0" w:oddHBand="0" w:evenHBand="1" w:firstRowFirstColumn="0" w:firstRowLastColumn="0" w:lastRowFirstColumn="0" w:lastRowLastColumn="0"/>
+            </w:pPr>
+            <w:r>
+              <w:rPr>
+                <w:sz w:val="20"/>
+              </w:rPr>
+              <w:t>US-02</w:t>
+            </w:r>
+          </w:p>
+        </w:tc>
+        <w:tc>
+          <w:tcPr>
+            <w:tcW w:w="1728" w:type="dxa"/>
+          </w:tcPr>
+          <w:p>
+            <w:pPr>
+              <w:cnfStyle w:val="000000010000" w:firstRow="0" w:lastRow="0" w:firstColumn="0" w:lastColumn="0" w:oddVBand="0" w:evenVBand="0" w:oddHBand="0" w:evenHBand="1" w:firstRowFirstColumn="0" w:firstRowLastColumn="0" w:lastRowFirstColumn="0" w:lastRowLastColumn="0"/>
+            </w:pPr>
+            <w:r>
+              <w:rPr>
+                <w:sz w:val="20"/>
+              </w:rPr>
+              <w:t>Sprint 1</w:t>
+            </w:r>
+          </w:p>
+        </w:tc>
+        <w:tc>
+          <w:tcPr>
+            <w:tcW w:w="1728" w:type="dxa"/>
+          </w:tcPr>
+          <w:p>
+            <w:pPr>
+              <w:cnfStyle w:val="000000010000" w:firstRow="0" w:lastRow="0" w:firstColumn="0" w:lastColumn="0" w:oddVBand="0" w:evenVBand="0" w:oddHBand="0" w:evenHBand="1" w:firstRowFirstColumn="0" w:firstRowLastColumn="0" w:lastRowFirstColumn="0" w:lastRowLastColumn="0"/>
+            </w:pPr>
+            <w:r>
+              <w:rPr>
+                <w:sz w:val="20"/>
+              </w:rPr>
+              <w:t>8</w:t>
+            </w:r>
+          </w:p>
+        </w:tc>
+      </w:tr>
+      <w:tr>
+        <w:trPr>
+          <w:cnfStyle w:val="000000100000" w:firstRow="0" w:lastRow="0" w:firstColumn="0" w:lastColumn="0" w:oddVBand="0" w:evenVBand="0" w:oddHBand="1" w:evenHBand="0" w:firstRowFirstColumn="0" w:firstRowLastColumn="0" w:lastRowFirstColumn="0" w:lastRowLastColumn="0"/>
+          <w:jc w:val="center"/>
+        </w:trPr>
+        <w:tc>
+          <w:tcPr>
+            <w:cnfStyle w:val="001000000000" w:firstRow="0" w:lastRow="0" w:firstColumn="1" w:lastColumn="0" w:oddVBand="0" w:evenVBand="0" w:oddHBand="0" w:evenHBand="0" w:firstRowFirstColumn="0" w:firstRowLastColumn="0" w:lastRowFirstColumn="0" w:lastRowLastColumn="0"/>
+            <w:tcW w:w="1728" w:type="dxa"/>
+          </w:tcPr>
+          <w:p>
+            <w:r>
+              <w:rPr>
+                <w:sz w:val="20"/>
+              </w:rPr>
+              <w:t>Облік складу по розмірах</w:t>
+            </w:r>
+          </w:p>
+        </w:tc>
+        <w:tc>
+          <w:tcPr>
+            <w:tcW w:w="1728" w:type="dxa"/>
+          </w:tcPr>
+          <w:p>
+            <w:pPr>
+              <w:cnfStyle w:val="000000100000" w:firstRow="0" w:lastRow="0" w:firstColumn="0" w:lastColumn="0" w:oddVBand="0" w:evenVBand="0" w:oddHBand="1" w:evenHBand="0" w:firstRowFirstColumn="0" w:firstRowLastColumn="0" w:lastRowFirstColumn="0" w:lastRowLastColumn="0"/>
+            </w:pPr>
+            <w:r>
+              <w:rPr>
+                <w:sz w:val="20"/>
+              </w:rPr>
+              <w:t>PostgreSQL + Redis</w:t>
+            </w:r>
+          </w:p>
+        </w:tc>
+        <w:tc>
+          <w:tcPr>
+            <w:tcW w:w="1728" w:type="dxa"/>
+          </w:tcPr>
+          <w:p>
+            <w:pPr>
+              <w:cnfStyle w:val="000000100000" w:firstRow="0" w:lastRow="0" w:firstColumn="0" w:lastColumn="0" w:oddVBand="0" w:evenVBand="0" w:oddHBand="1" w:evenHBand="0" w:firstRowFirstColumn="0" w:firstRowLastColumn="0" w:lastRowFirstColumn="0" w:lastRowLastColumn="0"/>
+            </w:pPr>
+            <w:r>
+              <w:rPr>
+                <w:sz w:val="20"/>
+              </w:rPr>
+              <w:t>US-05, US-06</w:t>
+            </w:r>
+          </w:p>
+        </w:tc>
+        <w:tc>
+          <w:tcPr>
+            <w:tcW w:w="1728" w:type="dxa"/>
+          </w:tcPr>
+          <w:p>
+            <w:pPr>
+              <w:cnfStyle w:val="000000100000" w:firstRow="0" w:lastRow="0" w:firstColumn="0" w:lastColumn="0" w:oddVBand="0" w:evenVBand="0" w:oddHBand="1" w:evenHBand="0" w:firstRowFirstColumn="0" w:firstRowLastColumn="0" w:lastRowFirstColumn="0" w:lastRowLastColumn="0"/>
+            </w:pPr>
+            <w:r>
+              <w:rPr>
+                <w:sz w:val="20"/>
+              </w:rPr>
+              <w:t>Sprint 1</w:t>
+            </w:r>
+          </w:p>
+        </w:tc>
+        <w:tc>
+          <w:tcPr>
+            <w:tcW w:w="1728" w:type="dxa"/>
+          </w:tcPr>
+          <w:p>
+            <w:pPr>
+              <w:cnfStyle w:val="000000100000" w:firstRow="0" w:lastRow="0" w:firstColumn="0" w:lastColumn="0" w:oddVBand="0" w:evenVBand="0" w:oddHBand="1" w:evenHBand="0" w:firstRowFirstColumn="0" w:firstRowLastColumn="0" w:lastRowFirstColumn="0" w:lastRowLastColumn="0"/>
+            </w:pPr>
+            <w:r>
+              <w:rPr>
+                <w:sz w:val="20"/>
+              </w:rPr>
+              <w:t>10</w:t>
+            </w:r>
+          </w:p>
+        </w:tc>
+      </w:tr>
+      <w:tr>
+        <w:trPr>
+          <w:cnfStyle w:val="000000010000" w:firstRow="0" w:lastRow="0" w:firstColumn="0" w:lastColumn="0" w:oddVBand="0" w:evenVBand="0" w:oddHBand="0" w:evenHBand="1" w:firstRowFirstColumn="0" w:firstRowLastColumn="0" w:lastRowFirstColumn="0" w:lastRowLastColumn="0"/>
+          <w:jc w:val="center"/>
+        </w:trPr>
+        <w:tc>
+          <w:tcPr>
+            <w:cnfStyle w:val="001000000000" w:firstRow="0" w:lastRow="0" w:firstColumn="1" w:lastColumn="0" w:oddVBand="0" w:evenVBand="0" w:oddHBand="0" w:evenHBand="0" w:firstRowFirstColumn="0" w:firstRowLastColumn="0" w:lastRowFirstColumn="0" w:lastRowLastColumn="0"/>
+            <w:tcW w:w="1728" w:type="dxa"/>
           </w:tcPr>
           <w:p>
             <w:r>
@@ -1245,7 +2153,91 @@
         </w:tc>
         <w:tc>
           <w:tcPr>
-            <w:tcW w:w="2160" w:type="dxa"/>
+            <w:tcW w:w="1728" w:type="dxa"/>
+          </w:tcPr>
+          <w:p>
+            <w:pPr>
+              <w:cnfStyle w:val="000000010000" w:firstRow="0" w:lastRow="0" w:firstColumn="0" w:lastColumn="0" w:oddVBand="0" w:evenVBand="0" w:oddHBand="0" w:evenHBand="1" w:firstRowFirstColumn="0" w:firstRowLastColumn="0" w:lastRowFirstColumn="0" w:lastRowLastColumn="0"/>
+            </w:pPr>
+            <w:r>
+              <w:rPr>
+                <w:sz w:val="20"/>
+              </w:rPr>
+              <w:t>LiqPay API</w:t>
+            </w:r>
+          </w:p>
+        </w:tc>
+        <w:tc>
+          <w:tcPr>
+            <w:tcW w:w="1728" w:type="dxa"/>
+          </w:tcPr>
+          <w:p>
+            <w:pPr>
+              <w:cnfStyle w:val="000000010000" w:firstRow="0" w:lastRow="0" w:firstColumn="0" w:lastColumn="0" w:oddVBand="0" w:evenVBand="0" w:oddHBand="0" w:evenHBand="1" w:firstRowFirstColumn="0" w:firstRowLastColumn="0" w:lastRowFirstColumn="0" w:lastRowLastColumn="0"/>
+            </w:pPr>
+            <w:r>
+              <w:rPr>
+                <w:sz w:val="20"/>
+              </w:rPr>
+              <w:t>US-12</w:t>
+            </w:r>
+          </w:p>
+        </w:tc>
+        <w:tc>
+          <w:tcPr>
+            <w:tcW w:w="1728" w:type="dxa"/>
+          </w:tcPr>
+          <w:p>
+            <w:pPr>
+              <w:cnfStyle w:val="000000010000" w:firstRow="0" w:lastRow="0" w:firstColumn="0" w:lastColumn="0" w:oddVBand="0" w:evenVBand="0" w:oddHBand="0" w:evenHBand="1" w:firstRowFirstColumn="0" w:firstRowLastColumn="0" w:lastRowFirstColumn="0" w:lastRowLastColumn="0"/>
+            </w:pPr>
+            <w:r>
+              <w:rPr>
+                <w:sz w:val="20"/>
+              </w:rPr>
+              <w:t>Sprint 2</w:t>
+            </w:r>
+          </w:p>
+        </w:tc>
+        <w:tc>
+          <w:tcPr>
+            <w:tcW w:w="1728" w:type="dxa"/>
+          </w:tcPr>
+          <w:p>
+            <w:pPr>
+              <w:cnfStyle w:val="000000010000" w:firstRow="0" w:lastRow="0" w:firstColumn="0" w:lastColumn="0" w:oddVBand="0" w:evenVBand="0" w:oddHBand="0" w:evenHBand="1" w:firstRowFirstColumn="0" w:firstRowLastColumn="0" w:lastRowFirstColumn="0" w:lastRowLastColumn="0"/>
+            </w:pPr>
+            <w:r>
+              <w:rPr>
+                <w:sz w:val="20"/>
+              </w:rPr>
+              <w:t>8</w:t>
+            </w:r>
+          </w:p>
+        </w:tc>
+      </w:tr>
+      <w:tr>
+        <w:trPr>
+          <w:cnfStyle w:val="000000100000" w:firstRow="0" w:lastRow="0" w:firstColumn="0" w:lastColumn="0" w:oddVBand="0" w:evenVBand="0" w:oddHBand="1" w:evenHBand="0" w:firstRowFirstColumn="0" w:firstRowLastColumn="0" w:lastRowFirstColumn="0" w:lastRowLastColumn="0"/>
+          <w:jc w:val="center"/>
+        </w:trPr>
+        <w:tc>
+          <w:tcPr>
+            <w:cnfStyle w:val="001000000000" w:firstRow="0" w:lastRow="0" w:firstColumn="1" w:lastColumn="0" w:oddVBand="0" w:evenVBand="0" w:oddHBand="0" w:evenHBand="0" w:firstRowFirstColumn="0" w:firstRowLastColumn="0" w:lastRowFirstColumn="0" w:lastRowLastColumn="0"/>
+            <w:tcW w:w="1728" w:type="dxa"/>
+          </w:tcPr>
+          <w:p>
+            <w:r>
+              <w:rPr>
+                <w:sz w:val="20"/>
+              </w:rPr>
+              <w:t>Накладений платіж</w:t>
+            </w:r>
+          </w:p>
+        </w:tc>
+        <w:tc>
+          <w:tcPr>
+            <w:tcW w:w="1728" w:type="dxa"/>
           </w:tcPr>
           <w:p>
             <w:pPr>
@@ -1255,13 +2247,13 @@
               <w:rPr>
                 <w:sz w:val="20"/>
               </w:rPr>
-              <w:t>LiqPay</w:t>
+              <w:t>Внутрішня логіка</w:t>
             </w:r>
           </w:p>
         </w:tc>
         <w:tc>
           <w:tcPr>
-            <w:tcW w:w="2160" w:type="dxa"/>
+            <w:tcW w:w="1728" w:type="dxa"/>
           </w:tcPr>
           <w:p>
             <w:pPr>
@@ -1271,13 +2263,13 @@
               <w:rPr>
                 <w:sz w:val="20"/>
               </w:rPr>
-              <w:t>Онлайн-платежі</w:t>
+              <w:t>US-13</w:t>
             </w:r>
           </w:p>
         </w:tc>
         <w:tc>
           <w:tcPr>
-            <w:tcW w:w="2160" w:type="dxa"/>
+            <w:tcW w:w="1728" w:type="dxa"/>
           </w:tcPr>
           <w:p>
             <w:pPr>
@@ -1287,7 +2279,23 @@
               <w:rPr>
                 <w:sz w:val="20"/>
               </w:rPr>
-              <w:t>2</w:t>
+              <w:t>Sprint 2</w:t>
+            </w:r>
+          </w:p>
+        </w:tc>
+        <w:tc>
+          <w:tcPr>
+            <w:tcW w:w="1728" w:type="dxa"/>
+          </w:tcPr>
+          <w:p>
+            <w:pPr>
+              <w:cnfStyle w:val="000000100000" w:firstRow="0" w:lastRow="0" w:firstColumn="0" w:lastColumn="0" w:oddVBand="0" w:evenVBand="0" w:oddHBand="1" w:evenHBand="0" w:firstRowFirstColumn="0" w:firstRowLastColumn="0" w:lastRowFirstColumn="0" w:lastRowLastColumn="0"/>
+            </w:pPr>
+            <w:r>
+              <w:rPr>
+                <w:sz w:val="20"/>
+              </w:rPr>
+              <w:t>3</w:t>
             </w:r>
           </w:p>
         </w:tc>
@@ -1300,20 +2308,20 @@
         <w:tc>
           <w:tcPr>
             <w:cnfStyle w:val="001000000000" w:firstRow="0" w:lastRow="0" w:firstColumn="1" w:lastColumn="0" w:oddVBand="0" w:evenVBand="0" w:oddHBand="0" w:evenHBand="0" w:firstRowFirstColumn="0" w:firstRowLastColumn="0" w:lastRowFirstColumn="0" w:lastRowLastColumn="0"/>
-            <w:tcW w:w="2160" w:type="dxa"/>
+            <w:tcW w:w="1728" w:type="dxa"/>
           </w:tcPr>
           <w:p>
             <w:r>
               <w:rPr>
                 <w:sz w:val="20"/>
               </w:rPr>
-              <w:t>Накладений платіж</w:t>
+              <w:t>Доставка НП</w:t>
             </w:r>
           </w:p>
         </w:tc>
         <w:tc>
           <w:tcPr>
-            <w:tcW w:w="2160" w:type="dxa"/>
+            <w:tcW w:w="1728" w:type="dxa"/>
           </w:tcPr>
           <w:p>
             <w:pPr>
@@ -1323,13 +2331,13 @@
               <w:rPr>
                 <w:sz w:val="20"/>
               </w:rPr>
-              <w:t>Власна логіка</w:t>
+              <w:t>Нова Пошта API</w:t>
             </w:r>
           </w:p>
         </w:tc>
         <w:tc>
           <w:tcPr>
-            <w:tcW w:w="2160" w:type="dxa"/>
+            <w:tcW w:w="1728" w:type="dxa"/>
           </w:tcPr>
           <w:p>
             <w:pPr>
@@ -1339,13 +2347,13 @@
               <w:rPr>
                 <w:sz w:val="20"/>
               </w:rPr>
-              <w:t>Оплата при отриманні</w:t>
+              <w:t>US-14, US-15</w:t>
             </w:r>
           </w:p>
         </w:tc>
         <w:tc>
           <w:tcPr>
-            <w:tcW w:w="2160" w:type="dxa"/>
+            <w:tcW w:w="1728" w:type="dxa"/>
           </w:tcPr>
           <w:p>
             <w:pPr>
@@ -1355,7 +2363,23 @@
               <w:rPr>
                 <w:sz w:val="20"/>
               </w:rPr>
-              <w:t>2</w:t>
+              <w:t>Sprint 2</w:t>
+            </w:r>
+          </w:p>
+        </w:tc>
+        <w:tc>
+          <w:tcPr>
+            <w:tcW w:w="1728" w:type="dxa"/>
+          </w:tcPr>
+          <w:p>
+            <w:pPr>
+              <w:cnfStyle w:val="000000010000" w:firstRow="0" w:lastRow="0" w:firstColumn="0" w:lastColumn="0" w:oddVBand="0" w:evenVBand="0" w:oddHBand="0" w:evenHBand="1" w:firstRowFirstColumn="0" w:firstRowLastColumn="0" w:lastRowFirstColumn="0" w:lastRowLastColumn="0"/>
+            </w:pPr>
+            <w:r>
+              <w:rPr>
+                <w:sz w:val="20"/>
+              </w:rPr>
+              <w:t>8</w:t>
             </w:r>
           </w:p>
         </w:tc>
@@ -1368,156 +2392,20 @@
         <w:tc>
           <w:tcPr>
             <w:cnfStyle w:val="001000000000" w:firstRow="0" w:lastRow="0" w:firstColumn="1" w:lastColumn="0" w:oddVBand="0" w:evenVBand="0" w:oddHBand="0" w:evenHBand="0" w:firstRowFirstColumn="0" w:firstRowLastColumn="0" w:lastRowFirstColumn="0" w:lastRowLastColumn="0"/>
-            <w:tcW w:w="2160" w:type="dxa"/>
+            <w:tcW w:w="1728" w:type="dxa"/>
           </w:tcPr>
           <w:p>
             <w:r>
               <w:rPr>
                 <w:sz w:val="20"/>
               </w:rPr>
-              <w:t>Доставка НП</w:t>
+              <w:t>Popup-консультація</w:t>
             </w:r>
           </w:p>
         </w:tc>
         <w:tc>
           <w:tcPr>
-            <w:tcW w:w="2160" w:type="dxa"/>
-          </w:tcPr>
-          <w:p>
-            <w:pPr>
-              <w:cnfStyle w:val="000000100000" w:firstRow="0" w:lastRow="0" w:firstColumn="0" w:lastColumn="0" w:oddVBand="0" w:evenVBand="0" w:oddHBand="1" w:evenHBand="0" w:firstRowFirstColumn="0" w:firstRowLastColumn="0" w:lastRowFirstColumn="0" w:lastRowLastColumn="0"/>
-            </w:pPr>
-            <w:r>
-              <w:rPr>
-                <w:sz w:val="20"/>
-              </w:rPr>
-              <w:t>Нова Пошта API</w:t>
-            </w:r>
-          </w:p>
-        </w:tc>
-        <w:tc>
-          <w:tcPr>
-            <w:tcW w:w="2160" w:type="dxa"/>
-          </w:tcPr>
-          <w:p>
-            <w:pPr>
-              <w:cnfStyle w:val="000000100000" w:firstRow="0" w:lastRow="0" w:firstColumn="0" w:lastColumn="0" w:oddVBand="0" w:evenVBand="0" w:oddHBand="1" w:evenHBand="0" w:firstRowFirstColumn="0" w:firstRowLastColumn="0" w:lastRowFirstColumn="0" w:lastRowLastColumn="0"/>
-            </w:pPr>
-            <w:r>
-              <w:rPr>
-                <w:sz w:val="20"/>
-              </w:rPr>
-              <w:t>Вибір відділення, ТТН</w:t>
-            </w:r>
-          </w:p>
-        </w:tc>
-        <w:tc>
-          <w:tcPr>
-            <w:tcW w:w="2160" w:type="dxa"/>
-          </w:tcPr>
-          <w:p>
-            <w:pPr>
-              <w:cnfStyle w:val="000000100000" w:firstRow="0" w:lastRow="0" w:firstColumn="0" w:lastColumn="0" w:oddVBand="0" w:evenVBand="0" w:oddHBand="1" w:evenHBand="0" w:firstRowFirstColumn="0" w:firstRowLastColumn="0" w:lastRowFirstColumn="0" w:lastRowLastColumn="0"/>
-            </w:pPr>
-            <w:r>
-              <w:rPr>
-                <w:sz w:val="20"/>
-              </w:rPr>
-              <w:t>2</w:t>
-            </w:r>
-          </w:p>
-        </w:tc>
-      </w:tr>
-      <w:tr>
-        <w:trPr>
-          <w:cnfStyle w:val="000000010000" w:firstRow="0" w:lastRow="0" w:firstColumn="0" w:lastColumn="0" w:oddVBand="0" w:evenVBand="0" w:oddHBand="0" w:evenHBand="1" w:firstRowFirstColumn="0" w:firstRowLastColumn="0" w:lastRowFirstColumn="0" w:lastRowLastColumn="0"/>
-          <w:jc w:val="center"/>
-        </w:trPr>
-        <w:tc>
-          <w:tcPr>
-            <w:cnfStyle w:val="001000000000" w:firstRow="0" w:lastRow="0" w:firstColumn="1" w:lastColumn="0" w:oddVBand="0" w:evenVBand="0" w:oddHBand="0" w:evenHBand="0" w:firstRowFirstColumn="0" w:firstRowLastColumn="0" w:lastRowFirstColumn="0" w:lastRowLastColumn="0"/>
-            <w:tcW w:w="2160" w:type="dxa"/>
-          </w:tcPr>
-          <w:p>
-            <w:r>
-              <w:rPr>
-                <w:sz w:val="20"/>
-              </w:rPr>
-              <w:t>Кур'єр</w:t>
-            </w:r>
-          </w:p>
-        </w:tc>
-        <w:tc>
-          <w:tcPr>
-            <w:tcW w:w="2160" w:type="dxa"/>
-          </w:tcPr>
-          <w:p>
-            <w:pPr>
-              <w:cnfStyle w:val="000000010000" w:firstRow="0" w:lastRow="0" w:firstColumn="0" w:lastColumn="0" w:oddVBand="0" w:evenVBand="0" w:oddHBand="0" w:evenHBand="1" w:firstRowFirstColumn="0" w:firstRowLastColumn="0" w:lastRowFirstColumn="0" w:lastRowLastColumn="0"/>
-            </w:pPr>
-            <w:r>
-              <w:rPr>
-                <w:sz w:val="20"/>
-              </w:rPr>
-              <w:t>Власна логіка</w:t>
-            </w:r>
-          </w:p>
-        </w:tc>
-        <w:tc>
-          <w:tcPr>
-            <w:tcW w:w="2160" w:type="dxa"/>
-          </w:tcPr>
-          <w:p>
-            <w:pPr>
-              <w:cnfStyle w:val="000000010000" w:firstRow="0" w:lastRow="0" w:firstColumn="0" w:lastColumn="0" w:oddVBand="0" w:evenVBand="0" w:oddHBand="0" w:evenHBand="1" w:firstRowFirstColumn="0" w:firstRowLastColumn="0" w:lastRowFirstColumn="0" w:lastRowLastColumn="0"/>
-            </w:pPr>
-            <w:r>
-              <w:rPr>
-                <w:sz w:val="20"/>
-              </w:rPr>
-              <w:t>Фіксована ціна</w:t>
-            </w:r>
-          </w:p>
-        </w:tc>
-        <w:tc>
-          <w:tcPr>
-            <w:tcW w:w="2160" w:type="dxa"/>
-          </w:tcPr>
-          <w:p>
-            <w:pPr>
-              <w:cnfStyle w:val="000000010000" w:firstRow="0" w:lastRow="0" w:firstColumn="0" w:lastColumn="0" w:oddVBand="0" w:evenVBand="0" w:oddHBand="0" w:evenHBand="1" w:firstRowFirstColumn="0" w:firstRowLastColumn="0" w:lastRowFirstColumn="0" w:lastRowLastColumn="0"/>
-            </w:pPr>
-            <w:r>
-              <w:rPr>
-                <w:sz w:val="20"/>
-              </w:rPr>
-              <w:t>2</w:t>
-            </w:r>
-          </w:p>
-        </w:tc>
-      </w:tr>
-      <w:tr>
-        <w:trPr>
-          <w:cnfStyle w:val="000000100000" w:firstRow="0" w:lastRow="0" w:firstColumn="0" w:lastColumn="0" w:oddVBand="0" w:evenVBand="0" w:oddHBand="1" w:evenHBand="0" w:firstRowFirstColumn="0" w:firstRowLastColumn="0" w:lastRowFirstColumn="0" w:lastRowLastColumn="0"/>
-          <w:jc w:val="center"/>
-        </w:trPr>
-        <w:tc>
-          <w:tcPr>
-            <w:cnfStyle w:val="001000000000" w:firstRow="0" w:lastRow="0" w:firstColumn="1" w:lastColumn="0" w:oddVBand="0" w:evenVBand="0" w:oddHBand="0" w:evenHBand="0" w:firstRowFirstColumn="0" w:firstRowLastColumn="0" w:lastRowFirstColumn="0" w:lastRowLastColumn="0"/>
-            <w:tcW w:w="2160" w:type="dxa"/>
-          </w:tcPr>
-          <w:p>
-            <w:r>
-              <w:rPr>
-                <w:sz w:val="20"/>
-              </w:rPr>
-              <w:t>Popup-чат</w:t>
-            </w:r>
-          </w:p>
-        </w:tc>
-        <w:tc>
-          <w:tcPr>
-            <w:tcW w:w="2160" w:type="dxa"/>
+            <w:tcW w:w="1728" w:type="dxa"/>
           </w:tcPr>
           <w:p>
             <w:pPr>
@@ -1533,7 +2421,7 @@
         </w:tc>
         <w:tc>
           <w:tcPr>
-            <w:tcW w:w="2160" w:type="dxa"/>
+            <w:tcW w:w="1728" w:type="dxa"/>
           </w:tcPr>
           <w:p>
             <w:pPr>
@@ -1543,13 +2431,13 @@
               <w:rPr>
                 <w:sz w:val="20"/>
               </w:rPr>
-              <w:t>Зв'язок з менеджером</w:t>
+              <w:t>US-16</w:t>
             </w:r>
           </w:p>
         </w:tc>
         <w:tc>
           <w:tcPr>
-            <w:tcW w:w="2160" w:type="dxa"/>
+            <w:tcW w:w="1728" w:type="dxa"/>
           </w:tcPr>
           <w:p>
             <w:pPr>
@@ -1559,7 +2447,23 @@
               <w:rPr>
                 <w:sz w:val="20"/>
               </w:rPr>
-              <w:t>2</w:t>
+              <w:t>Sprint 2</w:t>
+            </w:r>
+          </w:p>
+        </w:tc>
+        <w:tc>
+          <w:tcPr>
+            <w:tcW w:w="1728" w:type="dxa"/>
+          </w:tcPr>
+          <w:p>
+            <w:pPr>
+              <w:cnfStyle w:val="000000100000" w:firstRow="0" w:lastRow="0" w:firstColumn="0" w:lastColumn="0" w:oddVBand="0" w:evenVBand="0" w:oddHBand="1" w:evenHBand="0" w:firstRowFirstColumn="0" w:firstRowLastColumn="0" w:lastRowFirstColumn="0" w:lastRowLastColumn="0"/>
+            </w:pPr>
+            <w:r>
+              <w:rPr>
+                <w:sz w:val="20"/>
+              </w:rPr>
+              <w:t>3</w:t>
             </w:r>
           </w:p>
         </w:tc>
@@ -1572,20 +2476,20 @@
         <w:tc>
           <w:tcPr>
             <w:cnfStyle w:val="001000000000" w:firstRow="0" w:lastRow="0" w:firstColumn="1" w:lastColumn="0" w:oddVBand="0" w:evenVBand="0" w:oddHBand="0" w:evenHBand="0" w:firstRowFirstColumn="0" w:firstRowLastColumn="0" w:lastRowFirstColumn="0" w:lastRowLastColumn="0"/>
-            <w:tcW w:w="2160" w:type="dxa"/>
+            <w:tcW w:w="1728" w:type="dxa"/>
           </w:tcPr>
           <w:p>
             <w:r>
               <w:rPr>
                 <w:sz w:val="20"/>
               </w:rPr>
-              <w:t>Фото товарів</w:t>
+              <w:t>Адмін-панель</w:t>
             </w:r>
           </w:p>
         </w:tc>
         <w:tc>
           <w:tcPr>
-            <w:tcW w:w="2160" w:type="dxa"/>
+            <w:tcW w:w="1728" w:type="dxa"/>
           </w:tcPr>
           <w:p>
             <w:pPr>
@@ -1595,13 +2499,13 @@
               <w:rPr>
                 <w:sz w:val="20"/>
               </w:rPr>
-              <w:t>Cloudinary</w:t>
+              <w:t>Next.js + Prisma</w:t>
             </w:r>
           </w:p>
         </w:tc>
         <w:tc>
           <w:tcPr>
-            <w:tcW w:w="2160" w:type="dxa"/>
+            <w:tcW w:w="1728" w:type="dxa"/>
           </w:tcPr>
           <w:p>
             <w:pPr>
@@ -1611,13 +2515,13 @@
               <w:rPr>
                 <w:sz w:val="20"/>
               </w:rPr>
-              <w:t>Оптимізація зображень</w:t>
+              <w:t>US-17..US-19</w:t>
             </w:r>
           </w:p>
         </w:tc>
         <w:tc>
           <w:tcPr>
-            <w:tcW w:w="2160" w:type="dxa"/>
+            <w:tcW w:w="1728" w:type="dxa"/>
           </w:tcPr>
           <w:p>
             <w:pPr>
@@ -1627,7 +2531,23 @@
               <w:rPr>
                 <w:sz w:val="20"/>
               </w:rPr>
-              <w:t>1</w:t>
+              <w:t>Sprint 1-2</w:t>
+            </w:r>
+          </w:p>
+        </w:tc>
+        <w:tc>
+          <w:tcPr>
+            <w:tcW w:w="1728" w:type="dxa"/>
+          </w:tcPr>
+          <w:p>
+            <w:pPr>
+              <w:cnfStyle w:val="000000010000" w:firstRow="0" w:lastRow="0" w:firstColumn="0" w:lastColumn="0" w:oddVBand="0" w:evenVBand="0" w:oddHBand="0" w:evenHBand="1" w:firstRowFirstColumn="0" w:firstRowLastColumn="0" w:lastRowFirstColumn="0" w:lastRowLastColumn="0"/>
+            </w:pPr>
+            <w:r>
+              <w:rPr>
+                <w:sz w:val="20"/>
+              </w:rPr>
+              <w:t>13</w:t>
             </w:r>
           </w:p>
         </w:tc>
@@ -13553,7 +14473,7 @@
 </file>
 
 <file path=customXml/itemProps1.xml><?xml version="1.0" encoding="utf-8"?>
-<ds:datastoreItem xmlns:ds="http://schemas.openxmlformats.org/officeDocument/2006/customXml" ds:itemID="{F7ACF139-90AC-4E8E-9186-3C2762EA80A7}">
+<ds:datastoreItem xmlns:ds="http://schemas.openxmlformats.org/officeDocument/2006/customXml" ds:itemID="{F676AD39-326D-4AAD-9DE3-5A13F7BDA71A}">
   <ds:schemaRefs>
     <ds:schemaRef ds:uri="http://schemas.openxmlformats.org/officeDocument/2006/bibliography"/>
   </ds:schemaRefs>

</xml_diff>